<commit_message>
Implementa fluxo IEFA: alunos, turmas, inscrições, matrícula e relatórios.
Renomeia alunos de capacitação para alunos; adiciona turmas, inscrições, matrícula, cancelamento de matrícula, atendimentos de alunos, submódulos de relatório e PDFs no app Flutter, com migrations Prisma e documentação atualizada.

Co-authored-by: Cursor <cursoragent@cursor.com>
</commit_message>
<xml_diff>
--- a/Modelos Relatorios/FICHA DE INSCRIÇÃO IEFA - SOCIAL.docx
+++ b/Modelos Relatorios/FICHA DE INSCRIÇÃO IEFA - SOCIAL.docx
@@ -171,46 +171,45 @@
         <w:tblLook w:val="0000"/>
       </w:tblPr>
       <w:tblGrid>
-        <w:gridCol w:w="1759"/>
-        <w:gridCol w:w="861"/>
-        <w:gridCol w:w="31"/>
+        <w:gridCol w:w="1754"/>
+        <w:gridCol w:w="859"/>
+        <w:gridCol w:w="29"/>
         <w:gridCol w:w="111"/>
         <w:gridCol w:w="146"/>
         <w:gridCol w:w="13"/>
         <w:gridCol w:w="558"/>
-        <w:gridCol w:w="840"/>
+        <w:gridCol w:w="274"/>
+        <w:gridCol w:w="566"/>
         <w:gridCol w:w="142"/>
         <w:gridCol w:w="38"/>
-        <w:gridCol w:w="104"/>
-        <w:gridCol w:w="464"/>
+        <w:gridCol w:w="388"/>
+        <w:gridCol w:w="146"/>
+        <w:gridCol w:w="34"/>
         <w:gridCol w:w="101"/>
-        <w:gridCol w:w="179"/>
-        <w:gridCol w:w="389"/>
+        <w:gridCol w:w="568"/>
         <w:gridCol w:w="139"/>
         <w:gridCol w:w="39"/>
         <w:gridCol w:w="352"/>
-        <w:gridCol w:w="36"/>
-        <w:gridCol w:w="302"/>
+        <w:gridCol w:w="180"/>
+        <w:gridCol w:w="158"/>
         <w:gridCol w:w="12"/>
         <w:gridCol w:w="114"/>
-        <w:gridCol w:w="278"/>
-        <w:gridCol w:w="142"/>
+        <w:gridCol w:w="420"/>
         <w:gridCol w:w="181"/>
-        <w:gridCol w:w="387"/>
-        <w:gridCol w:w="19"/>
+        <w:gridCol w:w="395"/>
+        <w:gridCol w:w="11"/>
         <w:gridCol w:w="404"/>
         <w:gridCol w:w="426"/>
         <w:gridCol w:w="26"/>
-        <w:gridCol w:w="128"/>
+        <w:gridCol w:w="136"/>
         <w:gridCol w:w="16"/>
-        <w:gridCol w:w="8"/>
-        <w:gridCol w:w="9"/>
+        <w:gridCol w:w="17"/>
         <w:gridCol w:w="96"/>
-        <w:gridCol w:w="78"/>
+        <w:gridCol w:w="70"/>
         <w:gridCol w:w="373"/>
         <w:gridCol w:w="115"/>
         <w:gridCol w:w="567"/>
-        <w:gridCol w:w="615"/>
+        <w:gridCol w:w="624"/>
       </w:tblGrid>
       <w:tr>
         <w:trPr>
@@ -220,8 +219,8 @@
         </w:trPr>
         <w:tc>
           <w:tcPr>
-            <w:tcW w:w="10597" w:type="dxa"/>
-            <w:gridSpan w:val="40"/>
+            <w:tcW w:w="10598" w:type="dxa"/>
+            <w:gridSpan w:val="39"/>
             <w:shd w:val="clear" w:color="auto" w:fill="7F7F7F" w:themeFill="text1" w:themeFillTint="80"/>
             <w:vAlign w:val="center"/>
           </w:tcPr>
@@ -253,7 +252,7 @@
         </w:trPr>
         <w:tc>
           <w:tcPr>
-            <w:tcW w:w="2921" w:type="dxa"/>
+            <w:tcW w:w="2916" w:type="dxa"/>
             <w:gridSpan w:val="6"/>
             <w:tcBorders>
               <w:right w:val="nil"/>
@@ -309,7 +308,7 @@
         <w:tc>
           <w:tcPr>
             <w:tcW w:w="1564" w:type="dxa"/>
-            <w:gridSpan w:val="10"/>
+            <w:gridSpan w:val="9"/>
             <w:tcBorders>
               <w:left w:val="nil"/>
               <w:right w:val="nil"/>
@@ -336,7 +335,7 @@
         </w:tc>
         <w:tc>
           <w:tcPr>
-            <w:tcW w:w="1296" w:type="dxa"/>
+            <w:tcW w:w="1302" w:type="dxa"/>
             <w:gridSpan w:val="3"/>
             <w:tcBorders>
               <w:top w:val="nil"/>
@@ -367,7 +366,7 @@
         </w:trPr>
         <w:tc>
           <w:tcPr>
-            <w:tcW w:w="2921" w:type="dxa"/>
+            <w:tcW w:w="2916" w:type="dxa"/>
             <w:gridSpan w:val="6"/>
             <w:tcBorders>
               <w:right w:val="nil"/>
@@ -423,7 +422,7 @@
         <w:tc>
           <w:tcPr>
             <w:tcW w:w="1564" w:type="dxa"/>
-            <w:gridSpan w:val="10"/>
+            <w:gridSpan w:val="9"/>
             <w:tcBorders>
               <w:left w:val="nil"/>
               <w:right w:val="nil"/>
@@ -443,7 +442,7 @@
         </w:tc>
         <w:tc>
           <w:tcPr>
-            <w:tcW w:w="1296" w:type="dxa"/>
+            <w:tcW w:w="1302" w:type="dxa"/>
             <w:gridSpan w:val="3"/>
             <w:tcBorders>
               <w:top w:val="nil"/>
@@ -474,7 +473,7 @@
         </w:trPr>
         <w:tc>
           <w:tcPr>
-            <w:tcW w:w="2921" w:type="dxa"/>
+            <w:tcW w:w="2916" w:type="dxa"/>
             <w:gridSpan w:val="6"/>
             <w:tcBorders>
               <w:right w:val="nil"/>
@@ -506,7 +505,7 @@
         <w:tc>
           <w:tcPr>
             <w:tcW w:w="2247" w:type="dxa"/>
-            <w:gridSpan w:val="7"/>
+            <w:gridSpan w:val="9"/>
             <w:tcBorders>
               <w:top w:val="single" w:sz="4" w:space="0" w:color="auto"/>
               <w:left w:val="nil"/>
@@ -530,7 +529,7 @@
         <w:tc>
           <w:tcPr>
             <w:tcW w:w="707" w:type="dxa"/>
-            <w:gridSpan w:val="3"/>
+            <w:gridSpan w:val="2"/>
             <w:tcBorders>
               <w:top w:val="single" w:sz="4" w:space="0" w:color="auto"/>
               <w:left w:val="nil"/>
@@ -558,8 +557,8 @@
         </w:tc>
         <w:tc>
           <w:tcPr>
-            <w:tcW w:w="1861" w:type="dxa"/>
-            <w:gridSpan w:val="11"/>
+            <w:tcW w:w="1862" w:type="dxa"/>
+            <w:gridSpan w:val="10"/>
             <w:tcBorders>
               <w:top w:val="single" w:sz="4" w:space="0" w:color="auto"/>
               <w:left w:val="nil"/>
@@ -613,8 +612,8 @@
         </w:tc>
         <w:tc>
           <w:tcPr>
-            <w:tcW w:w="2004" w:type="dxa"/>
-            <w:gridSpan w:val="10"/>
+            <w:tcW w:w="2010" w:type="dxa"/>
+            <w:gridSpan w:val="9"/>
             <w:tcBorders>
               <w:bottom w:val="single" w:sz="4" w:space="0" w:color="auto"/>
             </w:tcBorders>
@@ -641,7 +640,7 @@
         </w:trPr>
         <w:tc>
           <w:tcPr>
-            <w:tcW w:w="2921" w:type="dxa"/>
+            <w:tcW w:w="2916" w:type="dxa"/>
             <w:gridSpan w:val="6"/>
             <w:vAlign w:val="bottom"/>
           </w:tcPr>
@@ -741,8 +740,8 @@
         </w:tc>
         <w:tc>
           <w:tcPr>
-            <w:tcW w:w="2456" w:type="dxa"/>
-            <w:gridSpan w:val="12"/>
+            <w:tcW w:w="2462" w:type="dxa"/>
+            <w:gridSpan w:val="11"/>
             <w:tcBorders>
               <w:bottom w:val="single" w:sz="4" w:space="0" w:color="auto"/>
             </w:tcBorders>
@@ -769,7 +768,7 @@
         </w:trPr>
         <w:tc>
           <w:tcPr>
-            <w:tcW w:w="2921" w:type="dxa"/>
+            <w:tcW w:w="2916" w:type="dxa"/>
             <w:gridSpan w:val="6"/>
             <w:vAlign w:val="bottom"/>
           </w:tcPr>
@@ -797,8 +796,8 @@
         </w:tc>
         <w:tc>
           <w:tcPr>
-            <w:tcW w:w="1682" w:type="dxa"/>
-            <w:gridSpan w:val="5"/>
+            <w:tcW w:w="832" w:type="dxa"/>
+            <w:gridSpan w:val="2"/>
             <w:tcBorders>
               <w:bottom w:val="single" w:sz="4" w:space="0" w:color="auto"/>
             </w:tcBorders>
@@ -818,8 +817,8 @@
         </w:tc>
         <w:tc>
           <w:tcPr>
-            <w:tcW w:w="2013" w:type="dxa"/>
-            <w:gridSpan w:val="10"/>
+            <w:tcW w:w="2863" w:type="dxa"/>
+            <w:gridSpan w:val="14"/>
             <w:vAlign w:val="center"/>
           </w:tcPr>
           <w:p>
@@ -843,7 +842,7 @@
         <w:tc>
           <w:tcPr>
             <w:tcW w:w="2800" w:type="dxa"/>
-            <w:gridSpan w:val="17"/>
+            <w:gridSpan w:val="15"/>
             <w:tcBorders>
               <w:bottom w:val="single" w:sz="4" w:space="0" w:color="auto"/>
             </w:tcBorders>
@@ -864,6 +863,9 @@
         <w:tc>
           <w:tcPr>
             <w:tcW w:w="567" w:type="dxa"/>
+            <w:tcBorders>
+              <w:bottom w:val="single" w:sz="4" w:space="0" w:color="auto"/>
+            </w:tcBorders>
             <w:vAlign w:val="center"/>
           </w:tcPr>
           <w:p>
@@ -875,18 +877,11 @@
                 <w:szCs w:val="16"/>
               </w:rPr>
             </w:pPr>
-            <w:r>
-              <w:rPr>
-                <w:sz w:val="16"/>
-                <w:szCs w:val="16"/>
-              </w:rPr>
-              <w:t>UF</w:t>
-            </w:r>
-          </w:p>
-        </w:tc>
-        <w:tc>
-          <w:tcPr>
-            <w:tcW w:w="615" w:type="dxa"/>
+          </w:p>
+        </w:tc>
+        <w:tc>
+          <w:tcPr>
+            <w:tcW w:w="620" w:type="dxa"/>
             <w:tcBorders>
               <w:bottom w:val="single" w:sz="4" w:space="0" w:color="auto"/>
             </w:tcBorders>
@@ -912,7 +907,7 @@
         </w:trPr>
         <w:tc>
           <w:tcPr>
-            <w:tcW w:w="2921" w:type="dxa"/>
+            <w:tcW w:w="2916" w:type="dxa"/>
             <w:gridSpan w:val="6"/>
             <w:vAlign w:val="bottom"/>
           </w:tcPr>
@@ -940,8 +935,8 @@
         </w:tc>
         <w:tc>
           <w:tcPr>
-            <w:tcW w:w="7676" w:type="dxa"/>
-            <w:gridSpan w:val="34"/>
+            <w:tcW w:w="7682" w:type="dxa"/>
+            <w:gridSpan w:val="33"/>
             <w:tcBorders>
               <w:bottom w:val="single" w:sz="4" w:space="0" w:color="auto"/>
             </w:tcBorders>
@@ -969,7 +964,7 @@
         </w:trPr>
         <w:tc>
           <w:tcPr>
-            <w:tcW w:w="2921" w:type="dxa"/>
+            <w:tcW w:w="2916" w:type="dxa"/>
             <w:gridSpan w:val="6"/>
             <w:vAlign w:val="bottom"/>
           </w:tcPr>
@@ -997,8 +992,8 @@
         </w:tc>
         <w:tc>
           <w:tcPr>
-            <w:tcW w:w="7676" w:type="dxa"/>
-            <w:gridSpan w:val="34"/>
+            <w:tcW w:w="7682" w:type="dxa"/>
+            <w:gridSpan w:val="33"/>
             <w:tcBorders>
               <w:bottom w:val="single" w:sz="4" w:space="0" w:color="auto"/>
             </w:tcBorders>
@@ -1026,7 +1021,7 @@
         </w:trPr>
         <w:tc>
           <w:tcPr>
-            <w:tcW w:w="2921" w:type="dxa"/>
+            <w:tcW w:w="2916" w:type="dxa"/>
             <w:gridSpan w:val="6"/>
             <w:vAlign w:val="bottom"/>
           </w:tcPr>
@@ -1054,8 +1049,8 @@
         </w:tc>
         <w:tc>
           <w:tcPr>
-            <w:tcW w:w="7676" w:type="dxa"/>
-            <w:gridSpan w:val="34"/>
+            <w:tcW w:w="7682" w:type="dxa"/>
+            <w:gridSpan w:val="33"/>
             <w:tcBorders>
               <w:bottom w:val="single" w:sz="4" w:space="0" w:color="auto"/>
             </w:tcBorders>
@@ -1083,7 +1078,7 @@
         </w:trPr>
         <w:tc>
           <w:tcPr>
-            <w:tcW w:w="2921" w:type="dxa"/>
+            <w:tcW w:w="2916" w:type="dxa"/>
             <w:gridSpan w:val="6"/>
             <w:vAlign w:val="bottom"/>
           </w:tcPr>
@@ -1111,8 +1106,8 @@
         </w:tc>
         <w:tc>
           <w:tcPr>
-            <w:tcW w:w="7676" w:type="dxa"/>
-            <w:gridSpan w:val="34"/>
+            <w:tcW w:w="7682" w:type="dxa"/>
+            <w:gridSpan w:val="33"/>
             <w:tcBorders>
               <w:bottom w:val="single" w:sz="4" w:space="0" w:color="auto"/>
             </w:tcBorders>
@@ -1140,8 +1135,8 @@
         </w:trPr>
         <w:tc>
           <w:tcPr>
-            <w:tcW w:w="10597" w:type="dxa"/>
-            <w:gridSpan w:val="40"/>
+            <w:tcW w:w="10598" w:type="dxa"/>
+            <w:gridSpan w:val="39"/>
             <w:shd w:val="clear" w:color="auto" w:fill="7F7F7F" w:themeFill="text1" w:themeFillTint="80"/>
             <w:vAlign w:val="center"/>
           </w:tcPr>
@@ -1173,7 +1168,7 @@
         </w:trPr>
         <w:tc>
           <w:tcPr>
-            <w:tcW w:w="2651" w:type="dxa"/>
+            <w:tcW w:w="2646" w:type="dxa"/>
             <w:gridSpan w:val="3"/>
             <w:vAlign w:val="bottom"/>
           </w:tcPr>
@@ -1201,7 +1196,7 @@
         </w:tc>
         <w:tc>
           <w:tcPr>
-            <w:tcW w:w="5066" w:type="dxa"/>
+            <w:tcW w:w="5071" w:type="dxa"/>
             <w:gridSpan w:val="23"/>
             <w:tcBorders>
               <w:bottom w:val="nil"/>
@@ -1245,8 +1240,8 @@
         </w:tc>
         <w:tc>
           <w:tcPr>
-            <w:tcW w:w="1877" w:type="dxa"/>
-            <w:gridSpan w:val="9"/>
+            <w:tcW w:w="1878" w:type="dxa"/>
+            <w:gridSpan w:val="8"/>
             <w:tcBorders>
               <w:bottom w:val="single" w:sz="4" w:space="0" w:color="auto"/>
             </w:tcBorders>
@@ -1273,7 +1268,7 @@
         </w:trPr>
         <w:tc>
           <w:tcPr>
-            <w:tcW w:w="2651" w:type="dxa"/>
+            <w:tcW w:w="2646" w:type="dxa"/>
             <w:gridSpan w:val="3"/>
             <w:vAlign w:val="bottom"/>
           </w:tcPr>
@@ -1301,7 +1296,7 @@
         </w:tc>
         <w:tc>
           <w:tcPr>
-            <w:tcW w:w="5066" w:type="dxa"/>
+            <w:tcW w:w="5071" w:type="dxa"/>
             <w:gridSpan w:val="23"/>
             <w:tcBorders>
               <w:top w:val="single" w:sz="4" w:space="0" w:color="auto"/>
@@ -1347,8 +1342,8 @@
         </w:tc>
         <w:tc>
           <w:tcPr>
-            <w:tcW w:w="1861" w:type="dxa"/>
-            <w:gridSpan w:val="8"/>
+            <w:tcW w:w="1862" w:type="dxa"/>
+            <w:gridSpan w:val="7"/>
             <w:tcBorders>
               <w:bottom w:val="single" w:sz="4" w:space="0" w:color="auto"/>
             </w:tcBorders>
@@ -1374,7 +1369,7 @@
         </w:trPr>
         <w:tc>
           <w:tcPr>
-            <w:tcW w:w="1759" w:type="dxa"/>
+            <w:tcW w:w="1756" w:type="dxa"/>
             <w:vAlign w:val="bottom"/>
           </w:tcPr>
           <w:p>
@@ -1401,7 +1396,7 @@
         </w:tc>
         <w:tc>
           <w:tcPr>
-            <w:tcW w:w="1149" w:type="dxa"/>
+            <w:tcW w:w="1147" w:type="dxa"/>
             <w:gridSpan w:val="4"/>
             <w:vAlign w:val="center"/>
           </w:tcPr>
@@ -1446,7 +1441,34 @@
         <w:tc>
           <w:tcPr>
             <w:tcW w:w="1020" w:type="dxa"/>
+            <w:gridSpan w:val="4"/>
+            <w:vAlign w:val="center"/>
+          </w:tcPr>
+          <w:p>
+            <w:pPr>
+              <w:pStyle w:val="FieldText"/>
+              <w:jc w:val="center"/>
+              <w:rPr>
+                <w:sz w:val="16"/>
+                <w:szCs w:val="16"/>
+              </w:rPr>
+            </w:pPr>
+            <w:r>
+              <w:rPr>
+                <w:sz w:val="16"/>
+                <w:szCs w:val="16"/>
+              </w:rPr>
+              <w:t>CEDIDA</w:t>
+            </w:r>
+          </w:p>
+        </w:tc>
+        <w:tc>
+          <w:tcPr>
+            <w:tcW w:w="568" w:type="dxa"/>
             <w:gridSpan w:val="3"/>
+            <w:tcBorders>
+              <w:bottom w:val="single" w:sz="4" w:space="0" w:color="auto"/>
+            </w:tcBorders>
             <w:vAlign w:val="center"/>
           </w:tcPr>
           <w:p>
@@ -1454,33 +1476,6 @@
               <w:pStyle w:val="FieldText"/>
               <w:jc w:val="center"/>
               <w:rPr>
-                <w:sz w:val="16"/>
-                <w:szCs w:val="16"/>
-              </w:rPr>
-            </w:pPr>
-            <w:r>
-              <w:rPr>
-                <w:sz w:val="16"/>
-                <w:szCs w:val="16"/>
-              </w:rPr>
-              <w:t>CEDIDA</w:t>
-            </w:r>
-          </w:p>
-        </w:tc>
-        <w:tc>
-          <w:tcPr>
-            <w:tcW w:w="568" w:type="dxa"/>
-            <w:gridSpan w:val="2"/>
-            <w:tcBorders>
-              <w:bottom w:val="single" w:sz="4" w:space="0" w:color="auto"/>
-            </w:tcBorders>
-            <w:vAlign w:val="center"/>
-          </w:tcPr>
-          <w:p>
-            <w:pPr>
-              <w:pStyle w:val="FieldText"/>
-              <w:jc w:val="center"/>
-              <w:rPr>
                 <w:b w:val="0"/>
                 <w:sz w:val="16"/>
                 <w:szCs w:val="16"/>
@@ -1491,7 +1486,7 @@
         <w:tc>
           <w:tcPr>
             <w:tcW w:w="1199" w:type="dxa"/>
-            <w:gridSpan w:val="6"/>
+            <w:gridSpan w:val="5"/>
             <w:vAlign w:val="center"/>
           </w:tcPr>
           <w:p>
@@ -1535,7 +1530,7 @@
         <w:tc>
           <w:tcPr>
             <w:tcW w:w="2198" w:type="dxa"/>
-            <w:gridSpan w:val="14"/>
+            <w:gridSpan w:val="12"/>
             <w:vAlign w:val="center"/>
           </w:tcPr>
           <w:p>
@@ -1558,7 +1553,7 @@
         </w:tc>
         <w:tc>
           <w:tcPr>
-            <w:tcW w:w="1669" w:type="dxa"/>
+            <w:tcW w:w="1675" w:type="dxa"/>
             <w:gridSpan w:val="4"/>
             <w:tcBorders>
               <w:bottom w:val="single" w:sz="4" w:space="0" w:color="auto"/>
@@ -1593,7 +1588,7 @@
         </w:trPr>
         <w:tc>
           <w:tcPr>
-            <w:tcW w:w="2651" w:type="dxa"/>
+            <w:tcW w:w="2646" w:type="dxa"/>
             <w:gridSpan w:val="3"/>
             <w:vAlign w:val="bottom"/>
           </w:tcPr>
@@ -1617,11 +1612,20 @@
               </w:rPr>
               <w:t>CIDADE</w:t>
             </w:r>
-          </w:p>
-        </w:tc>
-        <w:tc>
-          <w:tcPr>
-            <w:tcW w:w="5066" w:type="dxa"/>
+            <w:r>
+              <w:rPr>
+                <w:b/>
+                <w:sz w:val="16"/>
+                <w:szCs w:val="16"/>
+                <w:lang w:val="pt-BR"/>
+              </w:rPr>
+              <w:t xml:space="preserve"> / ESTADO</w:t>
+            </w:r>
+          </w:p>
+        </w:tc>
+        <w:tc>
+          <w:tcPr>
+            <w:tcW w:w="5071" w:type="dxa"/>
             <w:gridSpan w:val="23"/>
             <w:tcBorders>
               <w:bottom w:val="single" w:sz="4" w:space="0" w:color="auto"/>
@@ -1643,7 +1647,10 @@
         <w:tc>
           <w:tcPr>
             <w:tcW w:w="1132" w:type="dxa"/>
-            <w:gridSpan w:val="9"/>
+            <w:gridSpan w:val="8"/>
+            <w:tcBorders>
+              <w:bottom w:val="single" w:sz="4" w:space="0" w:color="auto"/>
+            </w:tcBorders>
             <w:vAlign w:val="center"/>
           </w:tcPr>
           <w:p>
@@ -1657,20 +1664,11 @@
                 <w:lang w:val="pt-BR"/>
               </w:rPr>
             </w:pPr>
-            <w:r>
-              <w:rPr>
-                <w:b/>
-                <w:sz w:val="16"/>
-                <w:szCs w:val="16"/>
-                <w:lang w:val="pt-BR"/>
-              </w:rPr>
-              <w:t>ESTADO</w:t>
-            </w:r>
-          </w:p>
-        </w:tc>
-        <w:tc>
-          <w:tcPr>
-            <w:tcW w:w="1748" w:type="dxa"/>
+          </w:p>
+        </w:tc>
+        <w:tc>
+          <w:tcPr>
+            <w:tcW w:w="1749" w:type="dxa"/>
             <w:gridSpan w:val="5"/>
             <w:tcBorders>
               <w:bottom w:val="single" w:sz="4" w:space="0" w:color="auto"/>
@@ -1698,7 +1696,7 @@
         </w:trPr>
         <w:tc>
           <w:tcPr>
-            <w:tcW w:w="2651" w:type="dxa"/>
+            <w:tcW w:w="2646" w:type="dxa"/>
             <w:gridSpan w:val="3"/>
             <w:vAlign w:val="bottom"/>
           </w:tcPr>
@@ -1727,7 +1725,7 @@
         <w:tc>
           <w:tcPr>
             <w:tcW w:w="1810" w:type="dxa"/>
-            <w:gridSpan w:val="6"/>
+            <w:gridSpan w:val="7"/>
             <w:tcBorders>
               <w:top w:val="single" w:sz="4" w:space="0" w:color="auto"/>
               <w:bottom w:val="single" w:sz="4" w:space="0" w:color="auto"/>
@@ -1774,8 +1772,8 @@
         </w:tc>
         <w:tc>
           <w:tcPr>
-            <w:tcW w:w="1982" w:type="dxa"/>
-            <w:gridSpan w:val="11"/>
+            <w:tcW w:w="1986" w:type="dxa"/>
+            <w:gridSpan w:val="10"/>
             <w:tcBorders>
               <w:top w:val="single" w:sz="4" w:space="0" w:color="auto"/>
               <w:bottom w:val="single" w:sz="4" w:space="0" w:color="auto"/>
@@ -1796,7 +1794,7 @@
         <w:tc>
           <w:tcPr>
             <w:tcW w:w="1036" w:type="dxa"/>
-            <w:gridSpan w:val="8"/>
+            <w:gridSpan w:val="7"/>
             <w:vAlign w:val="center"/>
           </w:tcPr>
           <w:p>
@@ -1818,7 +1816,7 @@
         </w:tc>
         <w:tc>
           <w:tcPr>
-            <w:tcW w:w="1844" w:type="dxa"/>
+            <w:tcW w:w="1845" w:type="dxa"/>
             <w:gridSpan w:val="6"/>
             <w:tcBorders>
               <w:bottom w:val="single" w:sz="4" w:space="0" w:color="auto"/>
@@ -1845,7 +1843,7 @@
         </w:trPr>
         <w:tc>
           <w:tcPr>
-            <w:tcW w:w="2651" w:type="dxa"/>
+            <w:tcW w:w="2646" w:type="dxa"/>
             <w:gridSpan w:val="3"/>
             <w:vAlign w:val="bottom"/>
           </w:tcPr>
@@ -1873,8 +1871,8 @@
         </w:tc>
         <w:tc>
           <w:tcPr>
-            <w:tcW w:w="7947" w:type="dxa"/>
-            <w:gridSpan w:val="37"/>
+            <w:tcW w:w="7952" w:type="dxa"/>
+            <w:gridSpan w:val="36"/>
             <w:tcBorders>
               <w:top w:val="single" w:sz="4" w:space="0" w:color="auto"/>
               <w:bottom w:val="single" w:sz="4" w:space="0" w:color="auto"/>
@@ -1902,7 +1900,7 @@
         </w:trPr>
         <w:tc>
           <w:tcPr>
-            <w:tcW w:w="2651" w:type="dxa"/>
+            <w:tcW w:w="2646" w:type="dxa"/>
             <w:gridSpan w:val="3"/>
             <w:vAlign w:val="bottom"/>
           </w:tcPr>
@@ -1930,8 +1928,8 @@
         </w:tc>
         <w:tc>
           <w:tcPr>
-            <w:tcW w:w="7947" w:type="dxa"/>
-            <w:gridSpan w:val="37"/>
+            <w:tcW w:w="7952" w:type="dxa"/>
+            <w:gridSpan w:val="36"/>
             <w:tcBorders>
               <w:top w:val="single" w:sz="4" w:space="0" w:color="auto"/>
               <w:bottom w:val="single" w:sz="4" w:space="0" w:color="auto"/>
@@ -1959,8 +1957,8 @@
         </w:trPr>
         <w:tc>
           <w:tcPr>
-            <w:tcW w:w="10597" w:type="dxa"/>
-            <w:gridSpan w:val="40"/>
+            <w:tcW w:w="10598" w:type="dxa"/>
+            <w:gridSpan w:val="39"/>
             <w:shd w:val="clear" w:color="auto" w:fill="7F7F7F" w:themeFill="text1" w:themeFillTint="80"/>
             <w:vAlign w:val="center"/>
           </w:tcPr>
@@ -2008,7 +2006,7 @@
         </w:trPr>
         <w:tc>
           <w:tcPr>
-            <w:tcW w:w="2651" w:type="dxa"/>
+            <w:tcW w:w="2646" w:type="dxa"/>
             <w:gridSpan w:val="3"/>
             <w:vAlign w:val="bottom"/>
           </w:tcPr>
@@ -2036,8 +2034,8 @@
         </w:tc>
         <w:tc>
           <w:tcPr>
-            <w:tcW w:w="7947" w:type="dxa"/>
-            <w:gridSpan w:val="37"/>
+            <w:tcW w:w="7952" w:type="dxa"/>
+            <w:gridSpan w:val="36"/>
             <w:tcBorders>
               <w:bottom w:val="single" w:sz="4" w:space="0" w:color="auto"/>
             </w:tcBorders>
@@ -2064,7 +2062,7 @@
         </w:trPr>
         <w:tc>
           <w:tcPr>
-            <w:tcW w:w="2651" w:type="dxa"/>
+            <w:tcW w:w="2646" w:type="dxa"/>
             <w:gridSpan w:val="3"/>
             <w:vAlign w:val="bottom"/>
           </w:tcPr>
@@ -2092,8 +2090,8 @@
         </w:tc>
         <w:tc>
           <w:tcPr>
-            <w:tcW w:w="7947" w:type="dxa"/>
-            <w:gridSpan w:val="37"/>
+            <w:tcW w:w="7952" w:type="dxa"/>
+            <w:gridSpan w:val="36"/>
             <w:tcBorders>
               <w:top w:val="single" w:sz="4" w:space="0" w:color="auto"/>
               <w:bottom w:val="single" w:sz="4" w:space="0" w:color="auto"/>
@@ -2121,8 +2119,8 @@
         </w:trPr>
         <w:tc>
           <w:tcPr>
-            <w:tcW w:w="10597" w:type="dxa"/>
-            <w:gridSpan w:val="40"/>
+            <w:tcW w:w="10598" w:type="dxa"/>
+            <w:gridSpan w:val="39"/>
             <w:shd w:val="clear" w:color="auto" w:fill="7F7F7F" w:themeFill="text1" w:themeFillTint="80"/>
             <w:vAlign w:val="center"/>
           </w:tcPr>
@@ -2155,7 +2153,7 @@
         </w:trPr>
         <w:tc>
           <w:tcPr>
-            <w:tcW w:w="2620" w:type="dxa"/>
+            <w:tcW w:w="2616" w:type="dxa"/>
             <w:gridSpan w:val="2"/>
             <w:vAlign w:val="bottom"/>
           </w:tcPr>
@@ -2186,8 +2184,8 @@
         </w:tc>
         <w:tc>
           <w:tcPr>
-            <w:tcW w:w="3294" w:type="dxa"/>
-            <w:gridSpan w:val="15"/>
+            <w:tcW w:w="3293" w:type="dxa"/>
+            <w:gridSpan w:val="16"/>
             <w:tcBorders>
               <w:bottom w:val="single" w:sz="4" w:space="0" w:color="auto"/>
             </w:tcBorders>
@@ -2208,7 +2206,7 @@
         <w:tc>
           <w:tcPr>
             <w:tcW w:w="1417" w:type="dxa"/>
-            <w:gridSpan w:val="8"/>
+            <w:gridSpan w:val="7"/>
             <w:vAlign w:val="center"/>
           </w:tcPr>
           <w:p>
@@ -2231,8 +2229,8 @@
         </w:tc>
         <w:tc>
           <w:tcPr>
-            <w:tcW w:w="3265" w:type="dxa"/>
-            <w:gridSpan w:val="15"/>
+            <w:tcW w:w="3272" w:type="dxa"/>
+            <w:gridSpan w:val="14"/>
             <w:tcBorders>
               <w:bottom w:val="single" w:sz="4" w:space="0" w:color="auto"/>
             </w:tcBorders>
@@ -2259,14 +2257,13 @@
         </w:trPr>
         <w:tc>
           <w:tcPr>
-            <w:tcW w:w="5347" w:type="dxa"/>
-            <w:gridSpan w:val="14"/>
+            <w:tcW w:w="3748" w:type="dxa"/>
+            <w:gridSpan w:val="8"/>
             <w:vAlign w:val="bottom"/>
           </w:tcPr>
           <w:p>
             <w:pPr>
               <w:pStyle w:val="Corpodetexto"/>
-              <w:jc w:val="center"/>
               <w:rPr>
                 <w:b/>
                 <w:sz w:val="16"/>
@@ -2296,8 +2293,8 @@
         </w:tc>
         <w:tc>
           <w:tcPr>
-            <w:tcW w:w="1661" w:type="dxa"/>
-            <w:gridSpan w:val="9"/>
+            <w:tcW w:w="1134" w:type="dxa"/>
+            <w:gridSpan w:val="4"/>
             <w:tcBorders>
               <w:bottom w:val="single" w:sz="4" w:space="0" w:color="auto"/>
             </w:tcBorders>
@@ -2317,14 +2314,16 @@
         </w:tc>
         <w:tc>
           <w:tcPr>
-            <w:tcW w:w="1737" w:type="dxa"/>
-            <w:gridSpan w:val="10"/>
+            <w:tcW w:w="1559" w:type="dxa"/>
+            <w:gridSpan w:val="8"/>
+            <w:tcBorders>
+              <w:bottom w:val="nil"/>
+            </w:tcBorders>
             <w:vAlign w:val="center"/>
           </w:tcPr>
           <w:p>
             <w:pPr>
               <w:pStyle w:val="FieldText"/>
-              <w:jc w:val="center"/>
               <w:rPr>
                 <w:sz w:val="16"/>
                 <w:szCs w:val="16"/>
@@ -2355,8 +2354,8 @@
         </w:tc>
         <w:tc>
           <w:tcPr>
-            <w:tcW w:w="1852" w:type="dxa"/>
-            <w:gridSpan w:val="7"/>
+            <w:tcW w:w="4157" w:type="dxa"/>
+            <w:gridSpan w:val="19"/>
             <w:tcBorders>
               <w:bottom w:val="single" w:sz="4" w:space="0" w:color="auto"/>
             </w:tcBorders>
@@ -2383,14 +2382,13 @@
         </w:trPr>
         <w:tc>
           <w:tcPr>
-            <w:tcW w:w="4319" w:type="dxa"/>
+            <w:tcW w:w="3748" w:type="dxa"/>
             <w:gridSpan w:val="8"/>
             <w:vAlign w:val="bottom"/>
           </w:tcPr>
           <w:p>
             <w:pPr>
               <w:pStyle w:val="Corpodetexto"/>
-              <w:jc w:val="center"/>
               <w:rPr>
                 <w:b/>
                 <w:sz w:val="16"/>
@@ -2411,8 +2409,8 @@
         </w:tc>
         <w:tc>
           <w:tcPr>
-            <w:tcW w:w="1983" w:type="dxa"/>
-            <w:gridSpan w:val="11"/>
+            <w:tcW w:w="1276" w:type="dxa"/>
+            <w:gridSpan w:val="5"/>
             <w:tcBorders>
               <w:bottom w:val="single" w:sz="4" w:space="0" w:color="auto"/>
             </w:tcBorders>
@@ -2432,14 +2430,13 @@
         </w:tc>
         <w:tc>
           <w:tcPr>
-            <w:tcW w:w="3114" w:type="dxa"/>
-            <w:gridSpan w:val="19"/>
+            <w:tcW w:w="2693" w:type="dxa"/>
+            <w:gridSpan w:val="13"/>
             <w:vAlign w:val="center"/>
           </w:tcPr>
           <w:p>
             <w:pPr>
               <w:pStyle w:val="FieldText"/>
-              <w:jc w:val="center"/>
               <w:rPr>
                 <w:sz w:val="16"/>
                 <w:szCs w:val="16"/>
@@ -2456,8 +2453,8 @@
         </w:tc>
         <w:tc>
           <w:tcPr>
-            <w:tcW w:w="1181" w:type="dxa"/>
-            <w:gridSpan w:val="2"/>
+            <w:tcW w:w="2881" w:type="dxa"/>
+            <w:gridSpan w:val="13"/>
             <w:tcBorders>
               <w:bottom w:val="single" w:sz="4" w:space="0" w:color="auto"/>
             </w:tcBorders>
@@ -2483,14 +2480,13 @@
         </w:trPr>
         <w:tc>
           <w:tcPr>
-            <w:tcW w:w="4319" w:type="dxa"/>
-            <w:gridSpan w:val="8"/>
+            <w:tcW w:w="4314" w:type="dxa"/>
+            <w:gridSpan w:val="9"/>
             <w:vAlign w:val="bottom"/>
           </w:tcPr>
           <w:p>
             <w:pPr>
               <w:pStyle w:val="Corpodetexto"/>
-              <w:jc w:val="center"/>
               <w:rPr>
                 <w:b/>
                 <w:sz w:val="16"/>
@@ -2511,8 +2507,8 @@
         </w:tc>
         <w:tc>
           <w:tcPr>
-            <w:tcW w:w="1983" w:type="dxa"/>
-            <w:gridSpan w:val="11"/>
+            <w:tcW w:w="714" w:type="dxa"/>
+            <w:gridSpan w:val="4"/>
             <w:tcBorders>
               <w:bottom w:val="single" w:sz="4" w:space="0" w:color="auto"/>
             </w:tcBorders>
@@ -2521,7 +2517,6 @@
           <w:p>
             <w:pPr>
               <w:pStyle w:val="FieldText"/>
-              <w:jc w:val="center"/>
               <w:rPr>
                 <w:b w:val="0"/>
                 <w:sz w:val="16"/>
@@ -2532,14 +2527,13 @@
         </w:tc>
         <w:tc>
           <w:tcPr>
-            <w:tcW w:w="3114" w:type="dxa"/>
-            <w:gridSpan w:val="19"/>
+            <w:tcW w:w="4383" w:type="dxa"/>
+            <w:gridSpan w:val="24"/>
             <w:vAlign w:val="center"/>
           </w:tcPr>
           <w:p>
             <w:pPr>
               <w:pStyle w:val="FieldText"/>
-              <w:jc w:val="center"/>
               <w:rPr>
                 <w:sz w:val="16"/>
                 <w:szCs w:val="16"/>
@@ -2556,7 +2550,7 @@
         </w:tc>
         <w:tc>
           <w:tcPr>
-            <w:tcW w:w="1181" w:type="dxa"/>
+            <w:tcW w:w="1187" w:type="dxa"/>
             <w:gridSpan w:val="2"/>
             <w:tcBorders>
               <w:bottom w:val="single" w:sz="4" w:space="0" w:color="auto"/>
@@ -2583,8 +2577,8 @@
         </w:trPr>
         <w:tc>
           <w:tcPr>
-            <w:tcW w:w="10597" w:type="dxa"/>
-            <w:gridSpan w:val="40"/>
+            <w:tcW w:w="10598" w:type="dxa"/>
+            <w:gridSpan w:val="39"/>
             <w:tcBorders>
               <w:bottom w:val="nil"/>
             </w:tcBorders>
@@ -2620,8 +2614,8 @@
         </w:trPr>
         <w:tc>
           <w:tcPr>
-            <w:tcW w:w="4603" w:type="dxa"/>
-            <w:gridSpan w:val="11"/>
+            <w:tcW w:w="3748" w:type="dxa"/>
+            <w:gridSpan w:val="8"/>
             <w:tcBorders>
               <w:bottom w:val="single" w:sz="4" w:space="0" w:color="auto"/>
             </w:tcBorders>
@@ -2660,8 +2654,8 @@
         </w:tc>
         <w:tc>
           <w:tcPr>
-            <w:tcW w:w="2001" w:type="dxa"/>
-            <w:gridSpan w:val="9"/>
+            <w:tcW w:w="2851" w:type="dxa"/>
+            <w:gridSpan w:val="13"/>
             <w:tcBorders>
               <w:bottom w:val="single" w:sz="4" w:space="0" w:color="auto"/>
             </w:tcBorders>
@@ -2692,7 +2686,7 @@
         <w:tc>
           <w:tcPr>
             <w:tcW w:w="1963" w:type="dxa"/>
-            <w:gridSpan w:val="9"/>
+            <w:gridSpan w:val="8"/>
             <w:tcBorders>
               <w:bottom w:val="single" w:sz="4" w:space="0" w:color="auto"/>
             </w:tcBorders>
@@ -2722,8 +2716,8 @@
         </w:tc>
         <w:tc>
           <w:tcPr>
-            <w:tcW w:w="2031" w:type="dxa"/>
-            <w:gridSpan w:val="11"/>
+            <w:tcW w:w="2036" w:type="dxa"/>
+            <w:gridSpan w:val="10"/>
             <w:tcBorders>
               <w:bottom w:val="single" w:sz="4" w:space="0" w:color="auto"/>
             </w:tcBorders>
@@ -2760,8 +2754,8 @@
         </w:trPr>
         <w:tc>
           <w:tcPr>
-            <w:tcW w:w="4603" w:type="dxa"/>
-            <w:gridSpan w:val="11"/>
+            <w:tcW w:w="3748" w:type="dxa"/>
+            <w:gridSpan w:val="8"/>
             <w:tcBorders>
               <w:top w:val="single" w:sz="4" w:space="0" w:color="auto"/>
               <w:bottom w:val="single" w:sz="4" w:space="0" w:color="auto"/>
@@ -2782,8 +2776,8 @@
         </w:tc>
         <w:tc>
           <w:tcPr>
-            <w:tcW w:w="2001" w:type="dxa"/>
-            <w:gridSpan w:val="9"/>
+            <w:tcW w:w="2851" w:type="dxa"/>
+            <w:gridSpan w:val="13"/>
             <w:tcBorders>
               <w:top w:val="single" w:sz="4" w:space="0" w:color="auto"/>
               <w:bottom w:val="single" w:sz="4" w:space="0" w:color="auto"/>
@@ -2805,7 +2799,7 @@
         <w:tc>
           <w:tcPr>
             <w:tcW w:w="1963" w:type="dxa"/>
-            <w:gridSpan w:val="9"/>
+            <w:gridSpan w:val="8"/>
             <w:tcBorders>
               <w:top w:val="single" w:sz="4" w:space="0" w:color="auto"/>
               <w:bottom w:val="single" w:sz="4" w:space="0" w:color="auto"/>
@@ -2826,8 +2820,8 @@
         </w:tc>
         <w:tc>
           <w:tcPr>
-            <w:tcW w:w="2031" w:type="dxa"/>
-            <w:gridSpan w:val="11"/>
+            <w:tcW w:w="2036" w:type="dxa"/>
+            <w:gridSpan w:val="10"/>
             <w:tcBorders>
               <w:top w:val="single" w:sz="4" w:space="0" w:color="auto"/>
               <w:bottom w:val="single" w:sz="4" w:space="0" w:color="auto"/>
@@ -2855,8 +2849,8 @@
         </w:trPr>
         <w:tc>
           <w:tcPr>
-            <w:tcW w:w="4603" w:type="dxa"/>
-            <w:gridSpan w:val="11"/>
+            <w:tcW w:w="3748" w:type="dxa"/>
+            <w:gridSpan w:val="8"/>
             <w:tcBorders>
               <w:top w:val="single" w:sz="4" w:space="0" w:color="auto"/>
               <w:bottom w:val="single" w:sz="4" w:space="0" w:color="auto"/>
@@ -2877,8 +2871,8 @@
         </w:tc>
         <w:tc>
           <w:tcPr>
-            <w:tcW w:w="2001" w:type="dxa"/>
-            <w:gridSpan w:val="9"/>
+            <w:tcW w:w="2851" w:type="dxa"/>
+            <w:gridSpan w:val="13"/>
             <w:tcBorders>
               <w:top w:val="single" w:sz="4" w:space="0" w:color="auto"/>
               <w:bottom w:val="single" w:sz="4" w:space="0" w:color="auto"/>
@@ -2900,7 +2894,7 @@
         <w:tc>
           <w:tcPr>
             <w:tcW w:w="1963" w:type="dxa"/>
-            <w:gridSpan w:val="9"/>
+            <w:gridSpan w:val="8"/>
             <w:tcBorders>
               <w:top w:val="single" w:sz="4" w:space="0" w:color="auto"/>
               <w:bottom w:val="single" w:sz="4" w:space="0" w:color="auto"/>
@@ -2921,8 +2915,8 @@
         </w:tc>
         <w:tc>
           <w:tcPr>
-            <w:tcW w:w="2031" w:type="dxa"/>
-            <w:gridSpan w:val="11"/>
+            <w:tcW w:w="2036" w:type="dxa"/>
+            <w:gridSpan w:val="10"/>
             <w:tcBorders>
               <w:top w:val="single" w:sz="4" w:space="0" w:color="auto"/>
               <w:bottom w:val="single" w:sz="4" w:space="0" w:color="auto"/>
@@ -2950,8 +2944,8 @@
         </w:trPr>
         <w:tc>
           <w:tcPr>
-            <w:tcW w:w="4603" w:type="dxa"/>
-            <w:gridSpan w:val="11"/>
+            <w:tcW w:w="3748" w:type="dxa"/>
+            <w:gridSpan w:val="8"/>
             <w:tcBorders>
               <w:top w:val="single" w:sz="4" w:space="0" w:color="auto"/>
               <w:bottom w:val="single" w:sz="4" w:space="0" w:color="auto"/>
@@ -2972,8 +2966,8 @@
         </w:tc>
         <w:tc>
           <w:tcPr>
-            <w:tcW w:w="2001" w:type="dxa"/>
-            <w:gridSpan w:val="9"/>
+            <w:tcW w:w="2851" w:type="dxa"/>
+            <w:gridSpan w:val="13"/>
             <w:tcBorders>
               <w:top w:val="single" w:sz="4" w:space="0" w:color="auto"/>
               <w:bottom w:val="single" w:sz="4" w:space="0" w:color="auto"/>
@@ -2995,7 +2989,7 @@
         <w:tc>
           <w:tcPr>
             <w:tcW w:w="1963" w:type="dxa"/>
-            <w:gridSpan w:val="9"/>
+            <w:gridSpan w:val="8"/>
             <w:tcBorders>
               <w:top w:val="single" w:sz="4" w:space="0" w:color="auto"/>
               <w:bottom w:val="single" w:sz="4" w:space="0" w:color="auto"/>
@@ -3016,8 +3010,8 @@
         </w:tc>
         <w:tc>
           <w:tcPr>
-            <w:tcW w:w="2031" w:type="dxa"/>
-            <w:gridSpan w:val="11"/>
+            <w:tcW w:w="2036" w:type="dxa"/>
+            <w:gridSpan w:val="10"/>
             <w:tcBorders>
               <w:top w:val="single" w:sz="4" w:space="0" w:color="auto"/>
               <w:bottom w:val="single" w:sz="4" w:space="0" w:color="auto"/>
@@ -3045,8 +3039,8 @@
         </w:trPr>
         <w:tc>
           <w:tcPr>
-            <w:tcW w:w="4603" w:type="dxa"/>
-            <w:gridSpan w:val="11"/>
+            <w:tcW w:w="3748" w:type="dxa"/>
+            <w:gridSpan w:val="8"/>
             <w:tcBorders>
               <w:top w:val="single" w:sz="4" w:space="0" w:color="auto"/>
               <w:bottom w:val="single" w:sz="4" w:space="0" w:color="auto"/>
@@ -3067,8 +3061,8 @@
         </w:tc>
         <w:tc>
           <w:tcPr>
-            <w:tcW w:w="2001" w:type="dxa"/>
-            <w:gridSpan w:val="9"/>
+            <w:tcW w:w="2851" w:type="dxa"/>
+            <w:gridSpan w:val="13"/>
             <w:tcBorders>
               <w:top w:val="single" w:sz="4" w:space="0" w:color="auto"/>
               <w:bottom w:val="single" w:sz="4" w:space="0" w:color="auto"/>
@@ -3090,7 +3084,7 @@
         <w:tc>
           <w:tcPr>
             <w:tcW w:w="1963" w:type="dxa"/>
-            <w:gridSpan w:val="9"/>
+            <w:gridSpan w:val="8"/>
             <w:tcBorders>
               <w:top w:val="single" w:sz="4" w:space="0" w:color="auto"/>
               <w:bottom w:val="single" w:sz="4" w:space="0" w:color="auto"/>
@@ -3111,8 +3105,8 @@
         </w:tc>
         <w:tc>
           <w:tcPr>
-            <w:tcW w:w="2031" w:type="dxa"/>
-            <w:gridSpan w:val="11"/>
+            <w:tcW w:w="2036" w:type="dxa"/>
+            <w:gridSpan w:val="10"/>
             <w:tcBorders>
               <w:top w:val="single" w:sz="4" w:space="0" w:color="auto"/>
               <w:bottom w:val="single" w:sz="4" w:space="0" w:color="auto"/>
@@ -3140,7 +3134,7 @@
         </w:trPr>
         <w:tc>
           <w:tcPr>
-            <w:tcW w:w="2762" w:type="dxa"/>
+            <w:tcW w:w="2757" w:type="dxa"/>
             <w:gridSpan w:val="4"/>
             <w:tcBorders>
               <w:top w:val="single" w:sz="4" w:space="0" w:color="auto"/>
@@ -3172,8 +3166,8 @@
         </w:tc>
         <w:tc>
           <w:tcPr>
-            <w:tcW w:w="7835" w:type="dxa"/>
-            <w:gridSpan w:val="36"/>
+            <w:tcW w:w="7841" w:type="dxa"/>
+            <w:gridSpan w:val="35"/>
             <w:tcBorders>
               <w:bottom w:val="single" w:sz="4" w:space="0" w:color="auto"/>
             </w:tcBorders>
@@ -4164,7 +4158,16 @@
         <w:szCs w:val="32"/>
         <w:lang w:val="pt-BR"/>
       </w:rPr>
-      <w:t xml:space="preserve">Instituto Educacional Francisco de Assis </w:t>
+      <w:t xml:space="preserve">                              Instituto E</w:t>
+    </w:r>
+    <w:r>
+      <w:rPr>
+        <w:b/>
+        <w:sz w:val="28"/>
+        <w:szCs w:val="32"/>
+        <w:lang w:val="pt-BR"/>
+      </w:rPr>
+      <w:t xml:space="preserve">ducacional Francisco de Assis </w:t>
     </w:r>
   </w:p>
   <w:p>

</xml_diff>